<commit_message>
Updating Javascript classes till Form Handling
</commit_message>
<xml_diff>
--- a/html/Tasks/Task - Renewable Energy Trends in 2024.docx
+++ b/html/Tasks/Task - Renewable Energy Trends in 2024.docx
@@ -1587,161 +1587,19 @@
           <w:sz w:val="24"/>
           <w:szCs w:val="24"/>
         </w:rPr>
-        <w:t>2024 has been a landmark year for renewable energy, witnessing record-breaking capacity additions, groundbreaking technological advancements, and transformative policy shifts. While challenges remain, the progress made this year signals a promising future for clean energy. As nations and industries unite in their efforts to combat climate change, renewable energy will remain at the heart of the global energy transition.</w:t>
-      </w:r>
-    </w:p>
-    <w:p>
-      <w:pPr>
-        <w:rPr>
-          <w:rFonts w:ascii="Segoe UI" w:hAnsi="Segoe UI" w:cs="Segoe UI"/>
-        </w:rPr>
-      </w:pPr>
-      <w:r>
-        <w:rPr>
-          <w:rFonts w:ascii="Segoe UI" w:hAnsi="Segoe UI" w:cs="Segoe UI"/>
-        </w:rPr>
-        <w:lastRenderedPageBreak/>
-        <w:t xml:space="preserve">Resume </w:t>
-      </w:r>
-      <w:r>
-        <w:rPr>
-          <w:rFonts w:ascii="Segoe UI" w:hAnsi="Segoe UI" w:cs="Segoe UI"/>
-        </w:rPr>
-        <w:t>Structure</w:t>
-      </w:r>
-    </w:p>
-    <w:p>
-      <w:pPr>
-        <w:rPr>
-          <w:rFonts w:ascii="Segoe UI" w:hAnsi="Segoe UI" w:cs="Segoe UI"/>
-        </w:rPr>
-      </w:pPr>
+        <w:t xml:space="preserve">2024 has been a landmark year for renewable energy, witnessing record-breaking capacity </w:t>
+      </w:r>
       <w:bookmarkStart w:id="0" w:name="_GoBack"/>
-      <w:r>
-        <w:rPr>
-          <w:rFonts w:ascii="Segoe UI" w:hAnsi="Segoe UI" w:cs="Segoe UI"/>
-        </w:rPr>
-        <w:t>Name</w:t>
-      </w:r>
-    </w:p>
-    <w:p>
-      <w:pPr>
-        <w:rPr>
-          <w:rFonts w:ascii="Segoe UI" w:hAnsi="Segoe UI" w:cs="Segoe UI"/>
-        </w:rPr>
-      </w:pPr>
-      <w:r>
-        <w:rPr>
-          <w:rFonts w:ascii="Segoe UI" w:hAnsi="Segoe UI" w:cs="Segoe UI"/>
-        </w:rPr>
-        <w:t xml:space="preserve">   About Yourself</w:t>
-      </w:r>
-    </w:p>
-    <w:p>
-      <w:pPr>
-        <w:rPr>
-          <w:rFonts w:ascii="Segoe UI" w:hAnsi="Segoe UI" w:cs="Segoe UI"/>
-        </w:rPr>
-      </w:pPr>
-      <w:r>
-        <w:rPr>
-          <w:rFonts w:ascii="Segoe UI" w:hAnsi="Segoe UI" w:cs="Segoe UI"/>
-        </w:rPr>
-        <w:t>Qualification</w:t>
-      </w:r>
-    </w:p>
-    <w:p>
-      <w:pPr>
-        <w:rPr>
-          <w:rFonts w:ascii="Segoe UI" w:hAnsi="Segoe UI" w:cs="Segoe UI"/>
-        </w:rPr>
-      </w:pPr>
-      <w:r>
-        <w:rPr>
-          <w:rFonts w:ascii="Segoe UI" w:hAnsi="Segoe UI" w:cs="Segoe UI"/>
-        </w:rPr>
-        <w:t xml:space="preserve">    10</w:t>
-      </w:r>
-      <w:r>
-        <w:rPr>
-          <w:rFonts w:ascii="Segoe UI" w:hAnsi="Segoe UI" w:cs="Segoe UI"/>
-          <w:vertAlign w:val="superscript"/>
-        </w:rPr>
-        <w:t>th</w:t>
-      </w:r>
-      <w:r>
-        <w:rPr>
-          <w:rFonts w:ascii="Segoe UI" w:hAnsi="Segoe UI" w:cs="Segoe UI"/>
-        </w:rPr>
-        <w:t>, 12</w:t>
-      </w:r>
-      <w:r>
-        <w:rPr>
-          <w:rFonts w:ascii="Segoe UI" w:hAnsi="Segoe UI" w:cs="Segoe UI"/>
-          <w:vertAlign w:val="superscript"/>
-        </w:rPr>
-        <w:t>th</w:t>
-      </w:r>
-      <w:r>
-        <w:rPr>
-          <w:rFonts w:ascii="Segoe UI" w:hAnsi="Segoe UI" w:cs="Segoe UI"/>
-        </w:rPr>
-        <w:t>, graduation</w:t>
-      </w:r>
-    </w:p>
-    <w:p>
-      <w:pPr>
-        <w:rPr>
-          <w:rFonts w:ascii="Segoe UI" w:hAnsi="Segoe UI" w:cs="Segoe UI"/>
-        </w:rPr>
-      </w:pPr>
-      <w:r>
-        <w:rPr>
-          <w:rFonts w:ascii="Segoe UI" w:hAnsi="Segoe UI" w:cs="Segoe UI"/>
-        </w:rPr>
-        <w:t>Certification/Training</w:t>
-      </w:r>
-    </w:p>
-    <w:p>
-      <w:pPr>
-        <w:rPr>
-          <w:rFonts w:ascii="Segoe UI" w:hAnsi="Segoe UI" w:cs="Segoe UI"/>
-        </w:rPr>
-      </w:pPr>
-      <w:r>
-        <w:rPr>
-          <w:rFonts w:ascii="Segoe UI" w:hAnsi="Segoe UI" w:cs="Segoe UI"/>
-        </w:rPr>
-        <w:t>Skills</w:t>
-      </w:r>
-    </w:p>
-    <w:p>
-      <w:pPr>
-        <w:rPr>
-          <w:rFonts w:ascii="Segoe UI" w:hAnsi="Segoe UI" w:cs="Segoe UI"/>
-        </w:rPr>
-      </w:pPr>
-      <w:r>
-        <w:rPr>
-          <w:rFonts w:ascii="Segoe UI" w:hAnsi="Segoe UI" w:cs="Segoe UI"/>
-        </w:rPr>
-        <w:t>Hobbies</w:t>
-      </w:r>
-    </w:p>
-    <w:p>
-      <w:pPr>
-        <w:rPr>
-          <w:rFonts w:ascii="Segoe UI" w:hAnsi="Segoe UI" w:cs="Segoe UI"/>
-        </w:rPr>
-      </w:pPr>
-      <w:r>
-        <w:rPr>
-          <w:rFonts w:ascii="Segoe UI" w:hAnsi="Segoe UI" w:cs="Segoe UI"/>
-        </w:rPr>
-        <w:t>Contact Details</w:t>
-      </w:r>
-    </w:p>
-    <w:bookmarkEnd w:id="0"/>
+      <w:bookmarkEnd w:id="0"/>
+      <w:r>
+        <w:rPr>
+          <w:rFonts w:ascii="Times New Roman" w:eastAsia="Times New Roman" w:hAnsi="Times New Roman" w:cs="Times New Roman"/>
+          <w:sz w:val="24"/>
+          <w:szCs w:val="24"/>
+        </w:rPr>
+        <w:t>additions, groundbreaking technological advancements, and transformative policy shifts. While challenges remain, the progress made this year signals a promising future for clean energy. As nations and industries unite in their efforts to combat climate change, renewable energy will remain at the heart of the global energy transition.</w:t>
+      </w:r>
+    </w:p>
     <w:p>
       <w:pPr>
         <w:rPr>

</xml_diff>